<commit_message>
2125 diagram: Hermes in place of Confluent Kafka everywhere
Co-Authored-By: Claude Fable 5.1 <noreply@anthropic.com>
Claude-Session: https://claude.ai/code/session_01UaiSzs85tKmfaeLA1rAxsP
</commit_message>
<xml_diff>
--- a/stories/2125-vamp-avr-inbound/VAMP Inbound - Architecture Diagram.docx
+++ b/stories/2125-vamp-avr-inbound/VAMP Inbound - Architecture Diagram.docx
@@ -72,7 +72,7 @@
           <w:sz w:val="18"/>
           <w:szCs w:val="18"/>
         </w:rPr>
-        <w:t xml:space="preserve">Prepared 25 September 2026. Architecture only; the build plan and the field mapping follow once the VAMP payload is available. The table below says which out-of-box code the design uses and which it cannot; the figure on the next page shows the whole path. The pattern is the one used for the CDP IVR inbound build (Kafka stream, script consumer, import set, transform map), with the application-vulnerability API of the integration framework in place of the infrastructure one.</w:t>
+        <w:t xml:space="preserve">Prepared 25 September 2026. Architecture only; build plan and field mapping follow once the VAMP payload is available. The table says which out-of-box code the design uses and which it cannot; the figure on the next page shows the whole path, in the shape of the CDP IVR inbound build with the application-vulnerability API in place of the infrastructure one.</w:t>
       </w:r>
     </w:p>
     <w:p>
@@ -246,7 +246,7 @@
                 <w:sz w:val="17"/>
                 <w:szCs w:val="17"/>
               </w:rPr>
-              <w:t xml:space="preserve">Stream Connect</w:t>
+              <w:t xml:space="preserve">Stream Connect on Hermes</w:t>
             </w:r>
           </w:p>
         </w:tc>
@@ -277,7 +277,7 @@
                 <w:sz w:val="17"/>
                 <w:szCs w:val="17"/>
               </w:rPr>
-              <w:t xml:space="preserve">Kafka topic, subscription, topic alias, stream, script consumer (sys_kafka_* and sys_sc_topic_alias)</w:t>
+              <w:t xml:space="preserve">Hermes, ServiceNow’s own Kafka cluster (hermes-internal); Kafka topic, subscription, topic alias, stream, script consumer (sys_kafka_* and sys_sc_topic_alias)</w:t>
             </w:r>
           </w:p>
         </w:tc>
@@ -308,7 +308,7 @@
                 <w:sz w:val="17"/>
                 <w:szCs w:val="17"/>
               </w:rPr>
-              <w:t xml:space="preserve">Configured. Topic sn_usem_vamp_inbound exists on dev; alias, stream and consumer are created in the application scope.</w:t>
+              <w:t xml:space="preserve">Configured. VAMP publishes to the Hermes topic sn_usem_vamp_inbound (exists on dev); alias, stream and consumer live in the application scope. No external cluster.</w:t>
             </w:r>
           </w:p>
         </w:tc>
@@ -775,7 +775,7 @@
                 <w:sz w:val="17"/>
                 <w:szCs w:val="17"/>
               </w:rPr>
-              <w:t xml:space="preserve">sn_sec_int_integration, sn_sec_int_impl, sn_vul_int_fw_integration_run and _process (or the classic sn_vul_integration_run / _process; the API accepts both)</w:t>
+              <w:t xml:space="preserve">sn_sec_int_integration, sn_sec_int_impl, sn_vul_int_fw_integration_run and _process (or classic sn_vul_integration_run / _process; the API accepts both)</w:t>
             </w:r>
           </w:p>
         </w:tc>
@@ -807,7 +807,7 @@
                 <w:sz w:val="17"/>
                 <w:szCs w:val="17"/>
               </w:rPr>
-              <w:t xml:space="preserve">Created once (integration, instance); run and process written per message by onStart, counts by onComplete, so the import is auditable like a scheduled one.</w:t>
+              <w:t xml:space="preserve">Integration and instance created once; run and process written per message by onStart, counts by onComplete, so the import is auditable like a scheduled one.</w:t>
             </w:r>
           </w:p>
         </w:tc>
@@ -1322,7 +1322,7 @@
       <w:r>
         <w:drawing>
           <wp:inline distT="0" distB="0" distL="0" distR="0">
-            <wp:extent cx="5715000" cy="8420100"/>
+            <wp:extent cx="5715000" cy="8505825"/>
             <wp:effectExtent t="0" r="0" b="0" l="0"/>
             <wp:docPr id="1" name="" descr="" title=""/>
             <wp:cNvGraphicFramePr>
@@ -1347,7 +1347,7 @@
                   <pic:spPr bwMode="auto">
                     <a:xfrm>
                       <a:off x="0" y="0"/>
-                      <a:ext cx="5715000" cy="8420100"/>
+                      <a:ext cx="5715000" cy="8505825"/>
                     </a:xfrm>
                     <a:prstGeom prst="rect">
                       <a:avLst/>

</xml_diff>